<commit_message>
feat(authoring): markdown is the default channel, and new content matches the document
edit/insert take their content as a positional argument, parsed as markdown
(--markdown stays as an alias; --text is the literal escape hatch). New
content looks like where it lands: a markdown bullet beside a list joins
that list and takes its look (continueList), a new styled paragraph takes
the direct formatting its style peers agree on, and whatever nothing closer
set falls back to the look at that position, then the document's dominant
face/size (the docx:base read shows) instead of the style chain's default —
one matchDocumentLook entry point owns that order. read shows a run's
east-asian/complex-script face only on text in that script, so Word's
every-slot font stamp no longer wraps every line in a noise span.

Co-Authored-By: Claude Opus 5.5 (1M context) <noreply@anthropic.com>
</commit_message>
<xml_diff>
--- a/tests/fixtures/lists.docx
+++ b/tests/fixtures/lists.docx
@@ -312,6 +312,26 @@
       </w:pPr>
       <w:r>
         <w:t xml:space="preserve">Phase two</w:t>
+      </w:r>
+    </w:p>
+    <w:p>
+      <w:pPr>
+        <w:pStyle w:val="ListParagraph"/>
+        <w:numPr>
+          <w:ilvl w:val="0"/>
+          <w:numId w:val="7"/>
+        </w:numPr>
+      </w:pPr>
+      <w:r>
+        <w:t xml:space="preserve">Phase three</w:t>
+      </w:r>
+    </w:p>
+    <w:p>
+      <w:pPr>
+        <w:pStyle w:val="Heading2"/>
+      </w:pPr>
+      <w:r>
+        <w:t xml:space="preserve">Appendix</w:t>
       </w:r>
     </w:p>
     <w:sectPr>
@@ -540,6 +560,12 @@
     </w:lvlOverride>
   </w:num>
   <w:num w:numId="7">
+    <w:abstractNumId w:val="1"/>
+    <w:lvlOverride w:ilvl="0">
+      <w:startOverride w:val="1"/>
+    </w:lvlOverride>
+  </w:num>
+  <w:num w:numId="8">
     <w:abstractNumId w:val="1"/>
     <w:lvlOverride w:ilvl="0">
       <w:startOverride w:val="1"/>

</xml_diff>